<commit_message>
Refresh Aug 22 2026: rebuild Joint Brokerage table from live data
</commit_message>
<xml_diff>
--- a/docs/templates/Kitchen_Complete_Reference.docx
+++ b/docs/templates/Kitchen_Complete_Reference.docx
@@ -3843,21 +3843,9 @@
             </w:tcMar>
           </w:tcPr>
           <w:p>
-            <w:pPr>
-              <w:jc w:val="left"/>
-            </w:pPr>
-            <w:r>
-              <w:rPr>
-                <w:rFonts w:ascii="Calibri" w:cs="Calibri" w:eastAsia="Calibri" w:hAnsi="Calibri"/>
-                <w:b w:val="false"/>
-                <w:bCs w:val="false"/>
-                <w:i w:val="false"/>
-                <w:iCs w:val="false"/>
-                <w:color w:val="000000"/>
-                <w:sz w:val="18"/>
-                <w:szCs w:val="18"/>
-              </w:rPr>
-              <w:t>$1,927</w:t>
+            <w:r/>
+            <w:r>
+              <w:t>$2,237</w:t>
             </w:r>
           </w:p>
         </w:tc>
@@ -3879,21 +3867,9 @@
             </w:tcMar>
           </w:tcPr>
           <w:p>
-            <w:pPr>
-              <w:jc w:val="left"/>
-            </w:pPr>
-            <w:r>
-              <w:rPr>
-                <w:rFonts w:ascii="Calibri" w:cs="Calibri" w:eastAsia="Calibri" w:hAnsi="Calibri"/>
-                <w:b w:val="false"/>
-                <w:bCs w:val="false"/>
-                <w:i w:val="false"/>
-                <w:iCs w:val="false"/>
-                <w:color w:val="000000"/>
-                <w:sz w:val="18"/>
-                <w:szCs w:val="18"/>
-              </w:rPr>
-              <w:t xml:space="preserve">$161</w:t>
+            <w:r/>
+            <w:r>
+              <w:t>$186</w:t>
             </w:r>
           </w:p>
         </w:tc>
@@ -3915,21 +3891,9 @@
             </w:tcMar>
           </w:tcPr>
           <w:p>
-            <w:pPr>
-              <w:jc w:val="left"/>
-            </w:pPr>
-            <w:r>
-              <w:rPr>
-                <w:rFonts w:ascii="Calibri" w:cs="Calibri" w:eastAsia="Calibri" w:hAnsi="Calibri"/>
-                <w:b w:val="false"/>
-                <w:bCs w:val="false"/>
-                <w:i w:val="false"/>
-                <w:iCs w:val="false"/>
-                <w:color w:val="000000"/>
-                <w:sz w:val="18"/>
-                <w:szCs w:val="18"/>
-              </w:rPr>
-              <w:t>$58,510</w:t>
+            <w:r/>
+            <w:r>
+              <w:t>$63,830</w:t>
             </w:r>
           </w:p>
         </w:tc>
@@ -14347,7 +14311,7 @@
           <w:sz w:val="24"/>
           <w:szCs w:val="24"/>
         </w:rPr>
-        <w:t>Joint Brokerage — $58,510 · $2,127/yr (TAXABLE)</w:t>
+        <w:t>Joint Brokerage — $63,830 · $2,237/yr (TAXABLE)</w:t>
       </w:r>
     </w:p>
     <w:p>
@@ -14451,16 +14415,12 @@
             </w:tcMar>
           </w:tcPr>
           <w:p>
-            <w:r>
-              <w:rPr>
-                <w:rFonts w:ascii="Calibri" w:cs="Calibri" w:eastAsia="Calibri" w:hAnsi="Calibri"/>
+            <w:r/>
+            <w:r>
+              <w:rPr>
                 <w:b/>
-                <w:bCs/>
-                <w:color w:val="FFFFFF"/>
-                <w:sz w:val="18"/>
-                <w:szCs w:val="18"/>
-              </w:rPr>
-              <w:t xml:space="preserve">Shares</w:t>
+              </w:rPr>
+              <w:t>390sh</w:t>
             </w:r>
           </w:p>
         </w:tc>
@@ -14482,16 +14442,12 @@
             </w:tcMar>
           </w:tcPr>
           <w:p>
-            <w:r>
-              <w:rPr>
-                <w:rFonts w:ascii="Calibri" w:cs="Calibri" w:eastAsia="Calibri" w:hAnsi="Calibri"/>
+            <w:r/>
+            <w:r>
+              <w:rPr>
                 <w:b/>
-                <w:bCs/>
-                <w:color w:val="FFFFFF"/>
-                <w:sz w:val="18"/>
-                <w:szCs w:val="18"/>
-              </w:rPr>
-              <w:t xml:space="preserve">Annual Income</w:t>
+              </w:rPr>
+              <w:t>$874/yr</w:t>
             </w:r>
           </w:p>
         </w:tc>
@@ -14513,16 +14469,12 @@
             </w:tcMar>
           </w:tcPr>
           <w:p>
-            <w:r>
-              <w:rPr>
-                <w:rFonts w:ascii="Calibri" w:cs="Calibri" w:eastAsia="Calibri" w:hAnsi="Calibri"/>
+            <w:r/>
+            <w:r>
+              <w:rPr>
                 <w:b/>
-                <w:bCs/>
-                <w:color w:val="FFFFFF"/>
-                <w:sz w:val="18"/>
-                <w:szCs w:val="18"/>
-              </w:rPr>
-              <w:t xml:space="preserve">Yield</w:t>
+              </w:rPr>
+              <w:t>5.9%</w:t>
             </w:r>
           </w:p>
         </w:tc>
@@ -14613,21 +14565,9 @@
             </w:tcMar>
           </w:tcPr>
           <w:p>
-            <w:pPr>
-              <w:jc w:val="left"/>
-            </w:pPr>
-            <w:r>
-              <w:rPr>
-                <w:rFonts w:ascii="Calibri" w:cs="Calibri" w:eastAsia="Calibri" w:hAnsi="Calibri"/>
-                <w:b w:val="false"/>
-                <w:bCs w:val="false"/>
-                <w:i w:val="false"/>
-                <w:iCs w:val="false"/>
-                <w:color w:val="000000"/>
-                <w:sz w:val="18"/>
-                <w:szCs w:val="18"/>
-              </w:rPr>
-              <w:t xml:space="preserve">320sh</w:t>
+            <w:r/>
+            <w:r>
+              <w:t>3,099.5u</w:t>
             </w:r>
           </w:p>
         </w:tc>
@@ -14649,21 +14589,9 @@
             </w:tcMar>
           </w:tcPr>
           <w:p>
-            <w:pPr>
-              <w:jc w:val="left"/>
-            </w:pPr>
-            <w:r>
-              <w:rPr>
-                <w:rFonts w:ascii="Calibri" w:cs="Calibri" w:eastAsia="Calibri" w:hAnsi="Calibri"/>
-                <w:b w:val="false"/>
-                <w:bCs w:val="false"/>
-                <w:i w:val="false"/>
-                <w:iCs w:val="false"/>
-                <w:color w:val="000000"/>
-                <w:sz w:val="18"/>
-                <w:szCs w:val="18"/>
-              </w:rPr>
-              <w:t xml:space="preserve">$697/yr</w:t>
+            <w:r/>
+            <w:r>
+              <w:t>$1,147/yr</w:t>
             </w:r>
           </w:p>
         </w:tc>
@@ -14685,21 +14613,9 @@
             </w:tcMar>
           </w:tcPr>
           <w:p>
-            <w:pPr>
-              <w:jc w:val="left"/>
-            </w:pPr>
-            <w:r>
-              <w:rPr>
-                <w:rFonts w:ascii="Calibri" w:cs="Calibri" w:eastAsia="Calibri" w:hAnsi="Calibri"/>
-                <w:b w:val="false"/>
-                <w:bCs w:val="false"/>
-                <w:i w:val="false"/>
-                <w:iCs w:val="false"/>
-                <w:color w:val="000000"/>
-                <w:sz w:val="18"/>
-                <w:szCs w:val="18"/>
-              </w:rPr>
-              <w:t xml:space="preserve">7.8%</w:t>
+            <w:r/>
+            <w:r>
+              <w:t>3.7%</w:t>
             </w:r>
           </w:p>
         </w:tc>
@@ -14795,21 +14711,9 @@
             </w:tcMar>
           </w:tcPr>
           <w:p>
-            <w:pPr>
-              <w:jc w:val="left"/>
-            </w:pPr>
-            <w:r>
-              <w:rPr>
-                <w:rFonts w:ascii="Calibri" w:cs="Calibri" w:eastAsia="Calibri" w:hAnsi="Calibri"/>
-                <w:b w:val="false"/>
-                <w:bCs w:val="false"/>
-                <w:i w:val="false"/>
-                <w:iCs w:val="false"/>
-                <w:color w:val="000000"/>
-                <w:sz w:val="18"/>
-                <w:szCs w:val="18"/>
-              </w:rPr>
-              <w:t xml:space="preserve">3,648u</w:t>
+            <w:r/>
+            <w:r>
+              <w:t>95sh</w:t>
             </w:r>
           </w:p>
         </w:tc>
@@ -14831,21 +14735,9 @@
             </w:tcMar>
           </w:tcPr>
           <w:p>
-            <w:pPr>
-              <w:jc w:val="left"/>
-            </w:pPr>
-            <w:r>
-              <w:rPr>
-                <w:rFonts w:ascii="Calibri" w:cs="Calibri" w:eastAsia="Calibri" w:hAnsi="Calibri"/>
-                <w:b w:val="false"/>
-                <w:bCs w:val="false"/>
-                <w:i w:val="false"/>
-                <w:iCs w:val="false"/>
-                <w:color w:val="000000"/>
-                <w:sz w:val="18"/>
-                <w:szCs w:val="18"/>
-              </w:rPr>
-              <w:t xml:space="preserve">$1,350/yr</w:t>
+            <w:r/>
+            <w:r>
+              <w:t>$190/yr</w:t>
             </w:r>
           </w:p>
         </w:tc>
@@ -14867,21 +14759,9 @@
             </w:tcMar>
           </w:tcPr>
           <w:p>
-            <w:pPr>
-              <w:jc w:val="left"/>
-            </w:pPr>
-            <w:r>
-              <w:rPr>
-                <w:rFonts w:ascii="Calibri" w:cs="Calibri" w:eastAsia="Calibri" w:hAnsi="Calibri"/>
-                <w:b w:val="false"/>
-                <w:bCs w:val="false"/>
-                <w:i w:val="false"/>
-                <w:iCs w:val="false"/>
-                <w:color w:val="000000"/>
-                <w:sz w:val="18"/>
-                <w:szCs w:val="18"/>
-              </w:rPr>
-              <w:t xml:space="preserve">3.1%</w:t>
+            <w:r/>
+            <w:r>
+              <w:t>1.4%</w:t>
             </w:r>
           </w:p>
         </w:tc>
@@ -14977,21 +14857,9 @@
             </w:tcMar>
           </w:tcPr>
           <w:p>
-            <w:pPr>
-              <w:jc w:val="left"/>
-            </w:pPr>
-            <w:r>
-              <w:rPr>
-                <w:rFonts w:ascii="Calibri" w:cs="Calibri" w:eastAsia="Calibri" w:hAnsi="Calibri"/>
-                <w:b w:val="false"/>
-                <w:bCs w:val="false"/>
-                <w:i w:val="false"/>
-                <w:iCs w:val="false"/>
-                <w:color w:val="000000"/>
-                <w:sz w:val="18"/>
-                <w:szCs w:val="18"/>
-              </w:rPr>
-              <w:t xml:space="preserve">100sh</w:t>
+            <w:r/>
+            <w:r>
+              <w:t>11sh</w:t>
             </w:r>
           </w:p>
         </w:tc>
@@ -15013,21 +14881,9 @@
             </w:tcMar>
           </w:tcPr>
           <w:p>
-            <w:pPr>
-              <w:jc w:val="left"/>
-            </w:pPr>
-            <w:r>
-              <w:rPr>
-                <w:rFonts w:ascii="Calibri" w:cs="Calibri" w:eastAsia="Calibri" w:hAnsi="Calibri"/>
-                <w:b w:val="false"/>
-                <w:bCs w:val="false"/>
-                <w:i w:val="false"/>
-                <w:iCs w:val="false"/>
-                <w:color w:val="000000"/>
-                <w:sz w:val="18"/>
-                <w:szCs w:val="18"/>
-              </w:rPr>
-              <w:t xml:space="preserve">$200/yr</w:t>
+            <w:r/>
+            <w:r>
+              <w:t>$26/yr</w:t>
             </w:r>
           </w:p>
         </w:tc>
@@ -15049,21 +14905,9 @@
             </w:tcMar>
           </w:tcPr>
           <w:p>
-            <w:pPr>
-              <w:jc w:val="left"/>
-            </w:pPr>
-            <w:r>
-              <w:rPr>
-                <w:rFonts w:ascii="Calibri" w:cs="Calibri" w:eastAsia="Calibri" w:hAnsi="Calibri"/>
-                <w:b w:val="false"/>
-                <w:bCs w:val="false"/>
-                <w:i w:val="false"/>
-                <w:iCs w:val="false"/>
-                <w:color w:val="000000"/>
-                <w:sz w:val="18"/>
-                <w:szCs w:val="18"/>
-              </w:rPr>
-              <w:t xml:space="preserve">1.1%</w:t>
+            <w:r/>
+            <w:r>
+              <w:t>0.6%</w:t>
             </w:r>
           </w:p>
         </w:tc>
@@ -15195,21 +15039,9 @@
             </w:tcMar>
           </w:tcPr>
           <w:p>
-            <w:pPr>
-              <w:jc w:val="left"/>
-            </w:pPr>
-            <w:r>
-              <w:rPr>
-                <w:rFonts w:ascii="Calibri" w:cs="Calibri" w:eastAsia="Calibri" w:hAnsi="Calibri"/>
-                <w:b w:val="false"/>
-                <w:bCs w:val="false"/>
-                <w:i w:val="false"/>
-                <w:iCs w:val="false"/>
-                <w:color w:val="000000"/>
-                <w:sz w:val="18"/>
-                <w:szCs w:val="18"/>
-              </w:rPr>
-              <w:t>$22/yr</w:t>
+            <w:r/>
+            <w:r>
+              <w:t>$2,237/yr</w:t>
             </w:r>
           </w:p>
         </w:tc>

</xml_diff>